<commit_message>
Align 3SL Ch 3-4 calibration with the chapter outline; add outline reference
Co-Authored-By: Claude Opus 5.5 <noreply@anthropic.com>
Claude-Session: https://claude.ai/code/session_01Vza9ZbwsuDNV7dNpAiGb3h
</commit_message>
<xml_diff>
--- a/calibration/3SL_Ch3-4_Calibration.docx
+++ b/calibration/3SL_Ch3-4_Calibration.docx
@@ -2210,7 +2210,7 @@
         <w:pStyle w:val="BodyText"/>
       </w:pPr>
       <w:r>
-        <w:t xml:space="preserve">It was a fair answer. Most people would have given him a name, a fake one, and he’d have known it was fake by the second syllable. She hadn’t bothered lying. She just stood there in the drip from Pell’s awning and let him not know, and Silas liked that more than he had time for.</w:t>
+        <w:t xml:space="preserve">It was a fair answer. Most people would have given him a name, a fake one, and he’d have known it was fake by the second syllable. She hadn’t bothered lying. She just stood there in the drip from Pell’s awning and let him not know, and Silas liked that more than he had time for. Six seconds, maybe, of standing in a lane with a job at his back and doing nothing but looking at somebody who wouldn’t tell him her name. From anybody else, he’d have called it a mistake.</w:t>
       </w:r>
     </w:p>
     <w:p>
@@ -2402,7 +2402,7 @@
         <w:pStyle w:val="BodyText"/>
       </w:pPr>
       <w:r>
-        <w:t xml:space="preserve">Melena looked at him from under the hood for a moment longer than the answer needed, then looked away. Silas went back over the lane in his head to see who might have turned for the crash and who might have kept looking afterward. He got the Hush shopkeeper, two women at the thread stall, a man with a cart who hadn’t looked up at all. Then he got Ironcross rings, Ashvein dust, a missing cousin, and</w:t>
+        <w:t xml:space="preserve">Melena looked at him from under the hood for a moment longer than the answer needed, then looked away. Silas went back over the lane in his head to see who might have turned for the crash and who might have kept looking afterward. He got the Hush shopkeeper, two women at the thread stall, a man with a cart who hadn’t looked up at all. Then he got the ring, the middle one, close enough to his sternum that he’d felt the cold of it through his shirt before her fist ever stopped. Then Ashvein dust, a missing cousin, and</w:t>
       </w:r>
       <w:r>
         <w:t xml:space="preserve"> </w:t>
@@ -2529,7 +2529,7 @@
         <w:pStyle w:val="BodyText"/>
       </w:pPr>
       <w:r>
-        <w:t xml:space="preserve">Her borrowed boots sounded too loud in the narrow stairwell. She heard it too and placed the next step more carefully. Silas kept to the side so she could use the rail and took the climb slower than he normally would. His shoulder didn’t object to that part.</w:t>
+        <w:t xml:space="preserve">Her borrowed boots sounded too loud in the narrow stairwell. She heard it too and placed the next step more carefully. Silas kept to the side so she could use the rail and took the climb slower than he normally would. His shoulder didn’t object to that part. The ring came up every one of those stairs with him.</w:t>
       </w:r>
     </w:p>
     <w:p>
@@ -2622,7 +2622,7 @@
         <w:pStyle w:val="BodyText"/>
       </w:pPr>
       <w:r>
-        <w:t xml:space="preserve">Back in the main room, he lifted the corner of the rug nearest the kitchen. The ward line under it hadn’t been disturbed. He laid the rug flat, checked the seals on the food, then took a bottle of water from the cabinet and set it within Melena’s reach.</w:t>
+        <w:t xml:space="preserve">Back in the main room, he lifted the corner of the rug nearest the kitchen. The ward line under it hadn’t been disturbed. He laid the rug flat, checked the seals on the food, then took a bottle of water from the cabinet. Behind the water, a locked grate held a short row of small dark bottles labeled for emergency Dimming. Silas checked that the lock held and looked at them a second longer than he needed to before he shut the cabinet and set the water within Melena’s reach.</w:t>
       </w:r>
     </w:p>
     <w:p>
@@ -3885,7 +3885,7 @@
         <w:pStyle w:val="BodyText"/>
       </w:pPr>
       <w:r>
-        <w:t xml:space="preserve">Pell didn’t unlock the drawer until they’d been gone several minutes.</w:t>
+        <w:t xml:space="preserve">Pell didn’t unlock the drawer until they’d been gone several minutes, and when he finally did, his hands were shaking hard enough that the key took two tries.</w:t>
       </w:r>
     </w:p>
     <w:p>
@@ -4157,23 +4157,23 @@
         <w:pStyle w:val="BodyText"/>
       </w:pPr>
       <w:r>
-        <w:t xml:space="preserve">Isola knew her from the way she stood before she could see her face, weight back, head turned just enough to count the turns ahead of her. Isola had never seen Asha stand like that anywhere she was supposed to be. The coat was dark, fitted close at the waist, and fell to her knees. Isola had never seen it in her life.</w:t>
-      </w:r>
-    </w:p>
-    <w:p>
-      <w:pPr>
-        <w:pStyle w:val="BodyText"/>
-      </w:pPr>
-      <w:r>
-        <w:t xml:space="preserve">Coats like that cost money. Money like that came from somewhere. Isola thought of the bags lined up against Asha’s wall, and the coin sitting against her own hip, and she didn’t like how easily the three things fit together.</w:t>
-      </w:r>
-    </w:p>
-    <w:p>
-      <w:pPr>
-        <w:pStyle w:val="BodyText"/>
-      </w:pPr>
-      <w:r>
-        <w:t xml:space="preserve">She turned from the counter, still talking.</w:t>
+        <w:t xml:space="preserve">Isola knew her from the way she stood before she could see her face, weight back, head turned just enough to count the turns ahead of her. Isola had never seen Asha stand like that anywhere she was supposed to be. The coat was dark, fitted close at the waist, and fell to her knees. A structured tote hung from her shoulder, stiff-sided and new, the kind of bag that held its shape whether there was anything in it or not. Isola had never seen either one in her life.</w:t>
+      </w:r>
+    </w:p>
+    <w:p>
+      <w:pPr>
+        <w:pStyle w:val="BodyText"/>
+      </w:pPr>
+      <w:r>
+        <w:t xml:space="preserve">Coats like that cost money. Bags like that too. Money like that came from somewhere. Isola thought of the bags lined up against Asha’s wall and the coin sitting against her own hip, and she didn’t like how easily it all fit together.</w:t>
+      </w:r>
+    </w:p>
+    <w:p>
+      <w:pPr>
+        <w:pStyle w:val="BodyText"/>
+      </w:pPr>
+      <w:r>
+        <w:t xml:space="preserve">She was already stepping away from the counter toward the bend, still talking over her shoulder.</w:t>
       </w:r>
       <w:r>
         <w:t xml:space="preserve"> </w:t>
@@ -4653,7 +4653,15 @@
         <w:t xml:space="preserve"> </w:t>
       </w:r>
       <w:r>
-        <w:t xml:space="preserve">and liked that a lot less, because she didn’t know what he thought he owed her or how he planned to pay it. Isola knew what owing meant. Owing came with a number and a day, and he hadn’t given her either one.</w:t>
+        <w:t xml:space="preserve">and liked that a lot less, because she didn’t know what he thought he owed her or how he planned to pay it. Isola knew what owing meant. Owing came with a number and a day, and he hadn’t given her either one. If she ever laid eyes on him again, she planned on collecting.</w:t>
+      </w:r>
+    </w:p>
+    <w:p>
+      <w:pPr>
+        <w:pStyle w:val="BodyText"/>
+      </w:pPr>
+      <w:r>
+        <w:t xml:space="preserve">Somewhere past Service Shaft, she caught her thumb working the middle ring around her finger, the one that had stopped an inch from his chest. She made herself quit. By Ashvein West, she was doing it again.</w:t>
       </w:r>
     </w:p>
     <w:p>

</xml_diff>